<commit_message>
Report: add 'Prepared for Dr Mieye Li' to the title page
Co-Authored-By: Claude Opus 5.5 <noreply@anthropic.com>
Claude-Session: https://claude.ai/code/session_01CeLW1aZP5CyXvqFJRiAA18
</commit_message>
<xml_diff>
--- a/report/Grid_LLM_Agent_Technical_Report.docx
+++ b/report/Grid_LLM_Agent_Technical_Report.docx
@@ -61,7 +61,7 @@
     </w:p>
     <w:p>
       <w:pPr>
-        <w:spacing w:after="600"/>
+        <w:spacing w:after="240"/>
       </w:pPr>
       <w:r>
         <w:rPr>
@@ -69,6 +69,20 @@
           <w:szCs w:val="24"/>
         </w:rPr>
         <w:t xml:space="preserve">October 2026</w:t>
+      </w:r>
+    </w:p>
+    <w:p>
+      <w:pPr>
+        <w:spacing w:after="600"/>
+      </w:pPr>
+      <w:r>
+        <w:rPr>
+          <w:i/>
+          <w:iCs/>
+          <w:sz w:val="24"/>
+          <w:szCs w:val="24"/>
+        </w:rPr>
+        <w:t xml:space="preserve">Prepared for Dr Mieye Li</w:t>
       </w:r>
     </w:p>
     <w:p>

</xml_diff>